<commit_message>
Engine-chapter review docx: regenerate with the Resolution table
Refresh the Council .docx from the resolved markdown (the prior build was blocked
by an open-file lock; md was already committed in 09240b7). Now carries the
RESOLVED header stamp and the finding->commit Resolution table.

Co-Authored-By: Claude Opus 4.8 <noreply@anthropic.com>
</commit_message>
<xml_diff>
--- a/_implementation-notes/peer-review-engine-chapter/Engine-Chapter-Peer-Review-Quantitative-Panel.docx
+++ b/_implementation-notes/peer-review-engine-chapter/Engine-Chapter-Peer-Review-Quantitative-Panel.docx
@@ -34,7 +34,7 @@
           <w:i/>
           <w:iCs/>
         </w:rPr>
-        <w:t xml:space="preserve">Diagnostic only — no edits without the author's go.</w:t>
+        <w:t xml:space="preserve">Originally diagnostic; now RESOLVED — the full punch-list below was adjudicated with the author, implemented dev-first, and mirrored to prod on 2026-06-17 (chapter now live at dev `62148ba` / prod `8d01617`). See the Resolution table at the end.</w:t>
       </w:r>
       <w:r>
         <w:rPr>
@@ -1389,7 +1389,7 @@
         <w:spacing w:after="140"/>
       </w:pPr>
       <w:r>
-        <w:t xml:space="preserve">Diagnostic. The headline is that the chapter's </w:t>
+        <w:t xml:space="preserve">The headline was that the chapter's </w:t>
       </w:r>
       <w:r>
         <w:rPr>
@@ -1399,7 +1399,7 @@
         <w:t xml:space="preserve">own</w:t>
       </w:r>
       <w:r>
-        <w:t xml:space="preserve"> guards are excellent and simply need to </w:t>
+        <w:t xml:space="preserve"> guards are excellent and simply needed to </w:t>
       </w:r>
       <w:r>
         <w:rPr>
@@ -1409,17 +1409,745 @@
         <w:t xml:space="preserve">reach one level up — from the individual soul to the congregation — and one level in — into the new quantities.</w:t>
       </w:r>
       <w:r>
-        <w:t xml:space="preserve"> None of the fixes touch the structural analogies (the Role Atlas / CLD kind), which all nine affirm. Recommended order if implemented: </w:t>
-      </w:r>
-      <w:r>
-        <w:rPr>
-          <w:b/>
-          <w:bCs/>
-        </w:rPr>
-        <w:t xml:space="preserve">H1 → H2 → M1/M2 → M3 → M4/M5 → lows.</w:t>
-      </w:r>
-      <w:r>
-        <w:t xml:space="preserve"> Adjudicate with the author (and, going forward, the Council); implement dev-first; mirror on the author's word.</w:t>
+        <w:t xml:space="preserve"> None of the fixes touched the structural analogies (the Role Atlas / CLD kind), which all nine affirmed.</w:t>
+      </w:r>
+    </w:p>
+    <w:p>
+      <w:pPr>
+        <w:pStyle w:val="Heading2"/>
+      </w:pPr>
+      <w:r>
+        <w:t xml:space="preserve">Resolution — implemented &amp; mirrored (2026-06-17)</w:t>
+      </w:r>
+    </w:p>
+    <w:p>
+      <w:pPr>
+        <w:spacing w:after="140"/>
+      </w:pPr>
+      <w:r>
+        <w:t xml:space="preserve">All nine reviewers' findings were adjudicated with the author and implemented dev-first, one item at a time, then mirrored to prod. The chapter is live at </w:t>
+      </w:r>
+      <w:r>
+        <w:rPr>
+          <w:b/>
+          <w:bCs/>
+        </w:rPr>
+        <w:t xml:space="preserve">dev `62148ba` / prod `8d01617`</w:t>
+      </w:r>
+      <w:r>
+        <w:t xml:space="preserve">; the structural analogies were left untouched.</w:t>
+      </w:r>
+    </w:p>
+    <w:tbl>
+      <w:tblPr>
+        <w:tblW w:type="dxa" w:w="9360"/>
+        <w:tblBorders>
+          <w:top w:val="single" w:color="auto" w:sz="4"/>
+          <w:left w:val="single" w:color="auto" w:sz="4"/>
+          <w:bottom w:val="single" w:color="auto" w:sz="4"/>
+          <w:right w:val="single" w:color="auto" w:sz="4"/>
+          <w:insideH w:val="single" w:color="auto" w:sz="4"/>
+          <w:insideV w:val="single" w:color="auto" w:sz="4"/>
+        </w:tblBorders>
+      </w:tblPr>
+      <w:tblGrid>
+        <w:gridCol w:w="7940"/>
+        <w:gridCol w:w="692"/>
+        <w:gridCol w:w="728"/>
+      </w:tblGrid>
+      <w:tr>
+        <w:trPr>
+          <w:tblHeader/>
+        </w:trPr>
+        <w:tc>
+          <w:tcPr>
+            <w:tcW w:type="dxa" w:w="7940"/>
+            <w:tcBorders>
+              <w:top w:val="single" w:color="BBBBBB" w:sz="1"/>
+              <w:left w:val="single" w:color="BBBBBB" w:sz="1"/>
+              <w:bottom w:val="single" w:color="BBBBBB" w:sz="1"/>
+              <w:right w:val="single" w:color="BBBBBB" w:sz="1"/>
+            </w:tcBorders>
+            <w:shd w:fill="D5E8F0" w:val="clear"/>
+            <w:tcMar>
+              <w:top w:type="dxa" w:w="60"/>
+              <w:left w:type="dxa" w:w="100"/>
+              <w:bottom w:type="dxa" w:w="60"/>
+              <w:right w:type="dxa" w:w="100"/>
+            </w:tcMar>
+            <w:vAlign w:val="center"/>
+          </w:tcPr>
+          <w:p>
+            <w:r>
+              <w:t xml:space="preserve">Finding</w:t>
+            </w:r>
+          </w:p>
+        </w:tc>
+        <w:tc>
+          <w:tcPr>
+            <w:tcW w:type="dxa" w:w="692"/>
+            <w:tcBorders>
+              <w:top w:val="single" w:color="BBBBBB" w:sz="1"/>
+              <w:left w:val="single" w:color="BBBBBB" w:sz="1"/>
+              <w:bottom w:val="single" w:color="BBBBBB" w:sz="1"/>
+              <w:right w:val="single" w:color="BBBBBB" w:sz="1"/>
+            </w:tcBorders>
+            <w:shd w:fill="D5E8F0" w:val="clear"/>
+            <w:tcMar>
+              <w:top w:type="dxa" w:w="60"/>
+              <w:left w:type="dxa" w:w="100"/>
+              <w:bottom w:type="dxa" w:w="60"/>
+              <w:right w:type="dxa" w:w="100"/>
+            </w:tcMar>
+            <w:vAlign w:val="center"/>
+          </w:tcPr>
+          <w:p>
+            <w:r>
+              <w:t xml:space="preserve">Status</w:t>
+            </w:r>
+          </w:p>
+        </w:tc>
+        <w:tc>
+          <w:tcPr>
+            <w:tcW w:type="dxa" w:w="728"/>
+            <w:tcBorders>
+              <w:top w:val="single" w:color="BBBBBB" w:sz="1"/>
+              <w:left w:val="single" w:color="BBBBBB" w:sz="1"/>
+              <w:bottom w:val="single" w:color="BBBBBB" w:sz="1"/>
+              <w:right w:val="single" w:color="BBBBBB" w:sz="1"/>
+            </w:tcBorders>
+            <w:shd w:fill="D5E8F0" w:val="clear"/>
+            <w:tcMar>
+              <w:top w:type="dxa" w:w="60"/>
+              <w:left w:type="dxa" w:w="100"/>
+              <w:bottom w:type="dxa" w:w="60"/>
+              <w:right w:type="dxa" w:w="100"/>
+            </w:tcMar>
+            <w:vAlign w:val="center"/>
+          </w:tcPr>
+          <w:p>
+            <w:r>
+              <w:t xml:space="preserve">Dev commit</w:t>
+            </w:r>
+          </w:p>
+        </w:tc>
+      </w:tr>
+      <w:tr>
+        <w:tc>
+          <w:tcPr>
+            <w:tcW w:type="dxa" w:w="7940"/>
+            <w:tcBorders>
+              <w:top w:val="single" w:color="BBBBBB" w:sz="1"/>
+              <w:left w:val="single" w:color="BBBBBB" w:sz="1"/>
+              <w:bottom w:val="single" w:color="BBBBBB" w:sz="1"/>
+              <w:right w:val="single" w:color="BBBBBB" w:sz="1"/>
+            </w:tcBorders>
+            <w:tcMar>
+              <w:top w:type="dxa" w:w="60"/>
+              <w:left w:type="dxa" w:w="100"/>
+              <w:bottom w:type="dxa" w:w="60"/>
+              <w:right w:type="dxa" w:w="100"/>
+            </w:tcMar>
+            <w:vAlign w:val="center"/>
+          </w:tcPr>
+          <w:p>
+            <w:r>
+              <w:rPr>
+                <w:b/>
+                <w:bCs/>
+              </w:rPr>
+              <w:t xml:space="preserve">H1</w:t>
+            </w:r>
+            <w:r>
+              <w:t xml:space="preserve"> — extend the guards from the soul to the congregation</w:t>
+            </w:r>
+          </w:p>
+        </w:tc>
+        <w:tc>
+          <w:tcPr>
+            <w:tcW w:type="dxa" w:w="692"/>
+            <w:tcBorders>
+              <w:top w:val="single" w:color="BBBBBB" w:sz="1"/>
+              <w:left w:val="single" w:color="BBBBBB" w:sz="1"/>
+              <w:bottom w:val="single" w:color="BBBBBB" w:sz="1"/>
+              <w:right w:val="single" w:color="BBBBBB" w:sz="1"/>
+            </w:tcBorders>
+            <w:tcMar>
+              <w:top w:type="dxa" w:w="60"/>
+              <w:left w:type="dxa" w:w="100"/>
+              <w:bottom w:type="dxa" w:w="60"/>
+              <w:right w:type="dxa" w:w="100"/>
+            </w:tcMar>
+            <w:vAlign w:val="center"/>
+          </w:tcPr>
+          <w:p>
+            <w:r>
+              <w:t xml:space="preserve">✓ Closed</w:t>
+            </w:r>
+          </w:p>
+        </w:tc>
+        <w:tc>
+          <w:tcPr>
+            <w:tcW w:type="dxa" w:w="728"/>
+            <w:tcBorders>
+              <w:top w:val="single" w:color="BBBBBB" w:sz="1"/>
+              <w:left w:val="single" w:color="BBBBBB" w:sz="1"/>
+              <w:bottom w:val="single" w:color="BBBBBB" w:sz="1"/>
+              <w:right w:val="single" w:color="BBBBBB" w:sz="1"/>
+            </w:tcBorders>
+            <w:tcMar>
+              <w:top w:type="dxa" w:w="60"/>
+              <w:left w:type="dxa" w:w="100"/>
+              <w:bottom w:type="dxa" w:w="60"/>
+              <w:right w:type="dxa" w:w="100"/>
+            </w:tcMar>
+            <w:vAlign w:val="center"/>
+          </w:tcPr>
+          <w:p>
+            <w:r>
+              <w:rPr>
+                <w:rFonts w:ascii="Consolas" w:cs="Consolas" w:eastAsia="Consolas" w:hAnsi="Consolas"/>
+                <w:sz w:val="20"/>
+                <w:szCs w:val="20"/>
+              </w:rPr>
+              <w:t xml:space="preserve">e2c1373</w:t>
+            </w:r>
+          </w:p>
+        </w:tc>
+      </w:tr>
+      <w:tr>
+        <w:tc>
+          <w:tcPr>
+            <w:tcW w:type="dxa" w:w="7940"/>
+            <w:tcBorders>
+              <w:top w:val="single" w:color="BBBBBB" w:sz="1"/>
+              <w:left w:val="single" w:color="BBBBBB" w:sz="1"/>
+              <w:bottom w:val="single" w:color="BBBBBB" w:sz="1"/>
+              <w:right w:val="single" w:color="BBBBBB" w:sz="1"/>
+            </w:tcBorders>
+            <w:tcMar>
+              <w:top w:type="dxa" w:w="60"/>
+              <w:left w:type="dxa" w:w="100"/>
+              <w:bottom w:type="dxa" w:w="60"/>
+              <w:right w:type="dxa" w:w="100"/>
+            </w:tcMar>
+            <w:vAlign w:val="center"/>
+          </w:tcPr>
+          <w:p>
+            <w:r>
+              <w:rPr>
+                <w:b/>
+                <w:bCs/>
+              </w:rPr>
+              <w:t xml:space="preserve">H2</w:t>
+            </w:r>
+            <w:r>
+              <w:t xml:space="preserve"> — repair the gift-of-faith section (1 Cor 12:7/11 charism frame; "suddenly possible"; barrier Eₐ only)</w:t>
+            </w:r>
+          </w:p>
+        </w:tc>
+        <w:tc>
+          <w:tcPr>
+            <w:tcW w:type="dxa" w:w="692"/>
+            <w:tcBorders>
+              <w:top w:val="single" w:color="BBBBBB" w:sz="1"/>
+              <w:left w:val="single" w:color="BBBBBB" w:sz="1"/>
+              <w:bottom w:val="single" w:color="BBBBBB" w:sz="1"/>
+              <w:right w:val="single" w:color="BBBBBB" w:sz="1"/>
+            </w:tcBorders>
+            <w:tcMar>
+              <w:top w:type="dxa" w:w="60"/>
+              <w:left w:type="dxa" w:w="100"/>
+              <w:bottom w:type="dxa" w:w="60"/>
+              <w:right w:type="dxa" w:w="100"/>
+            </w:tcMar>
+            <w:vAlign w:val="center"/>
+          </w:tcPr>
+          <w:p>
+            <w:r>
+              <w:t xml:space="preserve">✓ Closed</w:t>
+            </w:r>
+          </w:p>
+        </w:tc>
+        <w:tc>
+          <w:tcPr>
+            <w:tcW w:type="dxa" w:w="728"/>
+            <w:tcBorders>
+              <w:top w:val="single" w:color="BBBBBB" w:sz="1"/>
+              <w:left w:val="single" w:color="BBBBBB" w:sz="1"/>
+              <w:bottom w:val="single" w:color="BBBBBB" w:sz="1"/>
+              <w:right w:val="single" w:color="BBBBBB" w:sz="1"/>
+            </w:tcBorders>
+            <w:tcMar>
+              <w:top w:type="dxa" w:w="60"/>
+              <w:left w:type="dxa" w:w="100"/>
+              <w:bottom w:type="dxa" w:w="60"/>
+              <w:right w:type="dxa" w:w="100"/>
+            </w:tcMar>
+            <w:vAlign w:val="center"/>
+          </w:tcPr>
+          <w:p>
+            <w:r>
+              <w:rPr>
+                <w:rFonts w:ascii="Consolas" w:cs="Consolas" w:eastAsia="Consolas" w:hAnsi="Consolas"/>
+                <w:sz w:val="20"/>
+                <w:szCs w:val="20"/>
+              </w:rPr>
+              <w:t xml:space="preserve">74f760b</w:t>
+            </w:r>
+          </w:p>
+        </w:tc>
+      </w:tr>
+      <w:tr>
+        <w:tc>
+          <w:tcPr>
+            <w:tcW w:type="dxa" w:w="7940"/>
+            <w:tcBorders>
+              <w:top w:val="single" w:color="BBBBBB" w:sz="1"/>
+              <w:left w:val="single" w:color="BBBBBB" w:sz="1"/>
+              <w:bottom w:val="single" w:color="BBBBBB" w:sz="1"/>
+              <w:right w:val="single" w:color="BBBBBB" w:sz="1"/>
+            </w:tcBorders>
+            <w:tcMar>
+              <w:top w:type="dxa" w:w="60"/>
+              <w:left w:type="dxa" w:w="100"/>
+              <w:bottom w:type="dxa" w:w="60"/>
+              <w:right w:type="dxa" w:w="100"/>
+            </w:tcMar>
+            <w:vAlign w:val="center"/>
+          </w:tcPr>
+          <w:p>
+            <w:r>
+              <w:rPr>
+                <w:b/>
+                <w:bCs/>
+              </w:rPr>
+              <w:t xml:space="preserve">M1</w:t>
+            </w:r>
+            <w:r>
+              <w:t xml:space="preserve"> — tighten the boundary to ordinal-not-cardinal + police the symbols</w:t>
+            </w:r>
+          </w:p>
+        </w:tc>
+        <w:tc>
+          <w:tcPr>
+            <w:tcW w:type="dxa" w:w="692"/>
+            <w:tcBorders>
+              <w:top w:val="single" w:color="BBBBBB" w:sz="1"/>
+              <w:left w:val="single" w:color="BBBBBB" w:sz="1"/>
+              <w:bottom w:val="single" w:color="BBBBBB" w:sz="1"/>
+              <w:right w:val="single" w:color="BBBBBB" w:sz="1"/>
+            </w:tcBorders>
+            <w:tcMar>
+              <w:top w:type="dxa" w:w="60"/>
+              <w:left w:type="dxa" w:w="100"/>
+              <w:bottom w:type="dxa" w:w="60"/>
+              <w:right w:type="dxa" w:w="100"/>
+            </w:tcMar>
+            <w:vAlign w:val="center"/>
+          </w:tcPr>
+          <w:p>
+            <w:r>
+              <w:t xml:space="preserve">✓ Closed</w:t>
+            </w:r>
+          </w:p>
+        </w:tc>
+        <w:tc>
+          <w:tcPr>
+            <w:tcW w:type="dxa" w:w="728"/>
+            <w:tcBorders>
+              <w:top w:val="single" w:color="BBBBBB" w:sz="1"/>
+              <w:left w:val="single" w:color="BBBBBB" w:sz="1"/>
+              <w:bottom w:val="single" w:color="BBBBBB" w:sz="1"/>
+              <w:right w:val="single" w:color="BBBBBB" w:sz="1"/>
+            </w:tcBorders>
+            <w:tcMar>
+              <w:top w:type="dxa" w:w="60"/>
+              <w:left w:type="dxa" w:w="100"/>
+              <w:bottom w:type="dxa" w:w="60"/>
+              <w:right w:type="dxa" w:w="100"/>
+            </w:tcMar>
+            <w:vAlign w:val="center"/>
+          </w:tcPr>
+          <w:p>
+            <w:r>
+              <w:rPr>
+                <w:rFonts w:ascii="Consolas" w:cs="Consolas" w:eastAsia="Consolas" w:hAnsi="Consolas"/>
+                <w:sz w:val="20"/>
+                <w:szCs w:val="20"/>
+              </w:rPr>
+              <w:t xml:space="preserve">0dacdd5</w:t>
+            </w:r>
+          </w:p>
+        </w:tc>
+      </w:tr>
+      <w:tr>
+        <w:tc>
+          <w:tcPr>
+            <w:tcW w:type="dxa" w:w="7940"/>
+            <w:tcBorders>
+              <w:top w:val="single" w:color="BBBBBB" w:sz="1"/>
+              <w:left w:val="single" w:color="BBBBBB" w:sz="1"/>
+              <w:bottom w:val="single" w:color="BBBBBB" w:sz="1"/>
+              <w:right w:val="single" w:color="BBBBBB" w:sz="1"/>
+            </w:tcBorders>
+            <w:tcMar>
+              <w:top w:type="dxa" w:w="60"/>
+              <w:left w:type="dxa" w:w="100"/>
+              <w:bottom w:type="dxa" w:w="60"/>
+              <w:right w:type="dxa" w:w="100"/>
+            </w:tcMar>
+            <w:vAlign w:val="center"/>
+          </w:tcPr>
+          <w:p>
+            <w:r>
+              <w:rPr>
+                <w:b/>
+                <w:bCs/>
+              </w:rPr>
+              <w:t xml:space="preserve">M2</w:t>
+            </w:r>
+            <w:r>
+              <w:t xml:space="preserve"> — fix the temperature picture (ordered ardor; Spirit-as-reservoir; fruit-not-target)</w:t>
+            </w:r>
+          </w:p>
+        </w:tc>
+        <w:tc>
+          <w:tcPr>
+            <w:tcW w:type="dxa" w:w="692"/>
+            <w:tcBorders>
+              <w:top w:val="single" w:color="BBBBBB" w:sz="1"/>
+              <w:left w:val="single" w:color="BBBBBB" w:sz="1"/>
+              <w:bottom w:val="single" w:color="BBBBBB" w:sz="1"/>
+              <w:right w:val="single" w:color="BBBBBB" w:sz="1"/>
+            </w:tcBorders>
+            <w:tcMar>
+              <w:top w:type="dxa" w:w="60"/>
+              <w:left w:type="dxa" w:w="100"/>
+              <w:bottom w:type="dxa" w:w="60"/>
+              <w:right w:type="dxa" w:w="100"/>
+            </w:tcMar>
+            <w:vAlign w:val="center"/>
+          </w:tcPr>
+          <w:p>
+            <w:r>
+              <w:t xml:space="preserve">✓ Closed</w:t>
+            </w:r>
+          </w:p>
+        </w:tc>
+        <w:tc>
+          <w:tcPr>
+            <w:tcW w:type="dxa" w:w="728"/>
+            <w:tcBorders>
+              <w:top w:val="single" w:color="BBBBBB" w:sz="1"/>
+              <w:left w:val="single" w:color="BBBBBB" w:sz="1"/>
+              <w:bottom w:val="single" w:color="BBBBBB" w:sz="1"/>
+              <w:right w:val="single" w:color="BBBBBB" w:sz="1"/>
+            </w:tcBorders>
+            <w:tcMar>
+              <w:top w:type="dxa" w:w="60"/>
+              <w:left w:type="dxa" w:w="100"/>
+              <w:bottom w:type="dxa" w:w="60"/>
+              <w:right w:type="dxa" w:w="100"/>
+            </w:tcMar>
+            <w:vAlign w:val="center"/>
+          </w:tcPr>
+          <w:p>
+            <w:r>
+              <w:rPr>
+                <w:rFonts w:ascii="Consolas" w:cs="Consolas" w:eastAsia="Consolas" w:hAnsi="Consolas"/>
+                <w:sz w:val="20"/>
+                <w:szCs w:val="20"/>
+              </w:rPr>
+              <w:t xml:space="preserve">cbbb077</w:t>
+            </w:r>
+          </w:p>
+        </w:tc>
+      </w:tr>
+      <w:tr>
+        <w:tc>
+          <w:tcPr>
+            <w:tcW w:type="dxa" w:w="7940"/>
+            <w:tcBorders>
+              <w:top w:val="single" w:color="BBBBBB" w:sz="1"/>
+              <w:left w:val="single" w:color="BBBBBB" w:sz="1"/>
+              <w:bottom w:val="single" w:color="BBBBBB" w:sz="1"/>
+              <w:right w:val="single" w:color="BBBBBB" w:sz="1"/>
+            </w:tcBorders>
+            <w:tcMar>
+              <w:top w:type="dxa" w:w="60"/>
+              <w:left w:type="dxa" w:w="100"/>
+              <w:bottom w:type="dxa" w:w="60"/>
+              <w:right w:type="dxa" w:w="100"/>
+            </w:tcMar>
+            <w:vAlign w:val="center"/>
+          </w:tcPr>
+          <w:p>
+            <w:r>
+              <w:rPr>
+                <w:b/>
+                <w:bCs/>
+              </w:rPr>
+              <w:t xml:space="preserve">M3</w:t>
+            </w:r>
+            <w:r>
+              <w:t xml:space="preserve"> — name the believer's responsive part</w:t>
+            </w:r>
+          </w:p>
+        </w:tc>
+        <w:tc>
+          <w:tcPr>
+            <w:tcW w:type="dxa" w:w="692"/>
+            <w:tcBorders>
+              <w:top w:val="single" w:color="BBBBBB" w:sz="1"/>
+              <w:left w:val="single" w:color="BBBBBB" w:sz="1"/>
+              <w:bottom w:val="single" w:color="BBBBBB" w:sz="1"/>
+              <w:right w:val="single" w:color="BBBBBB" w:sz="1"/>
+            </w:tcBorders>
+            <w:tcMar>
+              <w:top w:type="dxa" w:w="60"/>
+              <w:left w:type="dxa" w:w="100"/>
+              <w:bottom w:type="dxa" w:w="60"/>
+              <w:right w:type="dxa" w:w="100"/>
+            </w:tcMar>
+            <w:vAlign w:val="center"/>
+          </w:tcPr>
+          <w:p>
+            <w:r>
+              <w:t xml:space="preserve">✓ Closed</w:t>
+            </w:r>
+          </w:p>
+        </w:tc>
+        <w:tc>
+          <w:tcPr>
+            <w:tcW w:type="dxa" w:w="728"/>
+            <w:tcBorders>
+              <w:top w:val="single" w:color="BBBBBB" w:sz="1"/>
+              <w:left w:val="single" w:color="BBBBBB" w:sz="1"/>
+              <w:bottom w:val="single" w:color="BBBBBB" w:sz="1"/>
+              <w:right w:val="single" w:color="BBBBBB" w:sz="1"/>
+            </w:tcBorders>
+            <w:tcMar>
+              <w:top w:type="dxa" w:w="60"/>
+              <w:left w:type="dxa" w:w="100"/>
+              <w:bottom w:type="dxa" w:w="60"/>
+              <w:right w:type="dxa" w:w="100"/>
+            </w:tcMar>
+            <w:vAlign w:val="center"/>
+          </w:tcPr>
+          <w:p>
+            <w:r>
+              <w:rPr>
+                <w:rFonts w:ascii="Consolas" w:cs="Consolas" w:eastAsia="Consolas" w:hAnsi="Consolas"/>
+                <w:sz w:val="20"/>
+                <w:szCs w:val="20"/>
+              </w:rPr>
+              <w:t xml:space="preserve">b00237b</w:t>
+            </w:r>
+          </w:p>
+        </w:tc>
+      </w:tr>
+      <w:tr>
+        <w:tc>
+          <w:tcPr>
+            <w:tcW w:type="dxa" w:w="7940"/>
+            <w:tcBorders>
+              <w:top w:val="single" w:color="BBBBBB" w:sz="1"/>
+              <w:left w:val="single" w:color="BBBBBB" w:sz="1"/>
+              <w:bottom w:val="single" w:color="BBBBBB" w:sz="1"/>
+              <w:right w:val="single" w:color="BBBBBB" w:sz="1"/>
+            </w:tcBorders>
+            <w:tcMar>
+              <w:top w:type="dxa" w:w="60"/>
+              <w:left w:type="dxa" w:w="100"/>
+              <w:bottom w:type="dxa" w:w="60"/>
+              <w:right w:type="dxa" w:w="100"/>
+            </w:tcMar>
+            <w:vAlign w:val="center"/>
+          </w:tcPr>
+          <w:p>
+            <w:r>
+              <w:rPr>
+                <w:b/>
+                <w:bCs/>
+              </w:rPr>
+              <w:t xml:space="preserve">M4/M5</w:t>
+            </w:r>
+            <w:r>
+              <w:t xml:space="preserve"> — </w:t>
+            </w:r>
+            <w:r>
+              <w:rPr>
+                <w:i/>
+                <w:iCs/>
+              </w:rPr>
+              <w:t xml:space="preserve">energeia</w:t>
+            </w:r>
+            <w:r>
+              <w:t xml:space="preserve"> precision + commensurability caution</w:t>
+            </w:r>
+          </w:p>
+        </w:tc>
+        <w:tc>
+          <w:tcPr>
+            <w:tcW w:type="dxa" w:w="692"/>
+            <w:tcBorders>
+              <w:top w:val="single" w:color="BBBBBB" w:sz="1"/>
+              <w:left w:val="single" w:color="BBBBBB" w:sz="1"/>
+              <w:bottom w:val="single" w:color="BBBBBB" w:sz="1"/>
+              <w:right w:val="single" w:color="BBBBBB" w:sz="1"/>
+            </w:tcBorders>
+            <w:tcMar>
+              <w:top w:type="dxa" w:w="60"/>
+              <w:left w:type="dxa" w:w="100"/>
+              <w:bottom w:type="dxa" w:w="60"/>
+              <w:right w:type="dxa" w:w="100"/>
+            </w:tcMar>
+            <w:vAlign w:val="center"/>
+          </w:tcPr>
+          <w:p>
+            <w:r>
+              <w:t xml:space="preserve">✓ Closed</w:t>
+            </w:r>
+          </w:p>
+        </w:tc>
+        <w:tc>
+          <w:tcPr>
+            <w:tcW w:type="dxa" w:w="728"/>
+            <w:tcBorders>
+              <w:top w:val="single" w:color="BBBBBB" w:sz="1"/>
+              <w:left w:val="single" w:color="BBBBBB" w:sz="1"/>
+              <w:bottom w:val="single" w:color="BBBBBB" w:sz="1"/>
+              <w:right w:val="single" w:color="BBBBBB" w:sz="1"/>
+            </w:tcBorders>
+            <w:tcMar>
+              <w:top w:type="dxa" w:w="60"/>
+              <w:left w:type="dxa" w:w="100"/>
+              <w:bottom w:type="dxa" w:w="60"/>
+              <w:right w:type="dxa" w:w="100"/>
+            </w:tcMar>
+            <w:vAlign w:val="center"/>
+          </w:tcPr>
+          <w:p>
+            <w:r>
+              <w:rPr>
+                <w:rFonts w:ascii="Consolas" w:cs="Consolas" w:eastAsia="Consolas" w:hAnsi="Consolas"/>
+                <w:sz w:val="20"/>
+                <w:szCs w:val="20"/>
+              </w:rPr>
+              <w:t xml:space="preserve">85dd8dc</w:t>
+            </w:r>
+          </w:p>
+        </w:tc>
+      </w:tr>
+      <w:tr>
+        <w:tc>
+          <w:tcPr>
+            <w:tcW w:type="dxa" w:w="7940"/>
+            <w:tcBorders>
+              <w:top w:val="single" w:color="BBBBBB" w:sz="1"/>
+              <w:left w:val="single" w:color="BBBBBB" w:sz="1"/>
+              <w:bottom w:val="single" w:color="BBBBBB" w:sz="1"/>
+              <w:right w:val="single" w:color="BBBBBB" w:sz="1"/>
+            </w:tcBorders>
+            <w:tcMar>
+              <w:top w:type="dxa" w:w="60"/>
+              <w:left w:type="dxa" w:w="100"/>
+              <w:bottom w:type="dxa" w:w="60"/>
+              <w:right w:type="dxa" w:w="100"/>
+            </w:tcMar>
+            <w:vAlign w:val="center"/>
+          </w:tcPr>
+          <w:p>
+            <w:r>
+              <w:rPr>
+                <w:b/>
+                <w:bCs/>
+              </w:rPr>
+              <w:t xml:space="preserve">LOWS</w:t>
+            </w:r>
+            <w:r>
+              <w:t xml:space="preserve"> (×5) — sentence-level fixes</w:t>
+            </w:r>
+          </w:p>
+        </w:tc>
+        <w:tc>
+          <w:tcPr>
+            <w:tcW w:type="dxa" w:w="692"/>
+            <w:tcBorders>
+              <w:top w:val="single" w:color="BBBBBB" w:sz="1"/>
+              <w:left w:val="single" w:color="BBBBBB" w:sz="1"/>
+              <w:bottom w:val="single" w:color="BBBBBB" w:sz="1"/>
+              <w:right w:val="single" w:color="BBBBBB" w:sz="1"/>
+            </w:tcBorders>
+            <w:tcMar>
+              <w:top w:type="dxa" w:w="60"/>
+              <w:left w:type="dxa" w:w="100"/>
+              <w:bottom w:type="dxa" w:w="60"/>
+              <w:right w:type="dxa" w:w="100"/>
+            </w:tcMar>
+            <w:vAlign w:val="center"/>
+          </w:tcPr>
+          <w:p>
+            <w:r>
+              <w:t xml:space="preserve">✓ Closed</w:t>
+            </w:r>
+          </w:p>
+        </w:tc>
+        <w:tc>
+          <w:tcPr>
+            <w:tcW w:type="dxa" w:w="728"/>
+            <w:tcBorders>
+              <w:top w:val="single" w:color="BBBBBB" w:sz="1"/>
+              <w:left w:val="single" w:color="BBBBBB" w:sz="1"/>
+              <w:bottom w:val="single" w:color="BBBBBB" w:sz="1"/>
+              <w:right w:val="single" w:color="BBBBBB" w:sz="1"/>
+            </w:tcBorders>
+            <w:tcMar>
+              <w:top w:type="dxa" w:w="60"/>
+              <w:left w:type="dxa" w:w="100"/>
+              <w:bottom w:type="dxa" w:w="60"/>
+              <w:right w:type="dxa" w:w="100"/>
+            </w:tcMar>
+            <w:vAlign w:val="center"/>
+          </w:tcPr>
+          <w:p>
+            <w:r>
+              <w:rPr>
+                <w:rFonts w:ascii="Consolas" w:cs="Consolas" w:eastAsia="Consolas" w:hAnsi="Consolas"/>
+                <w:sz w:val="20"/>
+                <w:szCs w:val="20"/>
+              </w:rPr>
+              <w:t xml:space="preserve">62148ba</w:t>
+            </w:r>
+          </w:p>
+        </w:tc>
+      </w:tr>
+    </w:tbl>
+    <w:p>
+      <w:pPr>
+        <w:spacing w:after="80"/>
+      </w:pPr>
+      <w:r>
+        <w:t xml:space="preserve"/>
+      </w:r>
+    </w:p>
+    <w:p>
+      <w:pPr>
+        <w:spacing w:after="140"/>
+      </w:pPr>
+      <w:r>
+        <w:t xml:space="preserve">Prod mirror commit: </w:t>
+      </w:r>
+      <w:r>
+        <w:rPr>
+          <w:b/>
+          <w:bCs/>
+        </w:rPr>
+        <w:t xml:space="preserve">`8d01617`</w:t>
+      </w:r>
+      <w:r>
+        <w:t xml:space="preserve">. This was the Peer-Review Panel Registry's first live run, end-to-end.</w:t>
       </w:r>
     </w:p>
     <w:sectPr>

</xml_diff>